<commit_message>
docs(manuals): tell operators how to register a forgotten service in the English user manual (4.6)
</commit_message>
<xml_diff>
--- a/09_MANUALES/EN/WORD/09_User_Manual.docx
+++ b/09_MANUALES/EN/WORD/09_User_Manual.docx
@@ -2,7 +2,7 @@
 <file path=word/document.xml><?xml version="1.0" encoding="utf-8"?>
 <w:document xmlns:w="http://schemas.openxmlformats.org/wordprocessingml/2006/main" xmlns:m="http://schemas.openxmlformats.org/officeDocument/2006/math" xmlns:r="http://schemas.openxmlformats.org/officeDocument/2006/relationships" xmlns:o="urn:schemas-microsoft-com:office:office" xmlns:v="urn:schemas-microsoft-com:vml" xmlns:w10="urn:schemas-microsoft-com:office:word" xmlns:a="http://schemas.openxmlformats.org/drawingml/2006/main" xmlns:pic="http://schemas.openxmlformats.org/drawingml/2006/picture" xmlns:wp="http://schemas.openxmlformats.org/drawingml/2006/wordprocessingDrawing">
   <w:body>
-    <w:bookmarkStart w:id="184" w:name="user-manual"/>
+    <w:bookmarkStart w:id="186" w:name="user-manual"/>
     <w:p>
       <w:pPr>
         <w:pStyle w:val="Heading1"/>
@@ -64,15 +64,15 @@
         <w:pStyle w:val="BodyText"/>
       </w:pPr>
       <w:r>
-        <w:t xml:space="preserve">October 17, 2026</w:t>
-      </w:r>
-    </w:p>
-    <w:p>
-      <w:pPr>
-        <w:pStyle w:val="BodyText"/>
-      </w:pPr>
-      <w:r>
-        <w:t xml:space="preserve">Manual Type: User Manual (Customer and Operator Roles) · Version 4.1</w:t>
+        <w:t xml:space="preserve">October 21, 2026</w:t>
+      </w:r>
+    </w:p>
+    <w:p>
+      <w:pPr>
+        <w:pStyle w:val="BodyText"/>
+      </w:pPr>
+      <w:r>
+        <w:t xml:space="preserve">Manual Type: User Manual (Customer and Operator Roles) · Version 4.6</w:t>
       </w:r>
     </w:p>
     <w:bookmarkStart w:id="20" w:name="version-control"/>
@@ -623,6 +623,114 @@
           </w:p>
         </w:tc>
       </w:tr>
+      <w:tr>
+        <w:tc>
+          <w:tcPr/>
+          <w:p>
+            <w:pPr>
+              <w:pStyle w:val="Compact"/>
+            </w:pPr>
+            <w:r>
+              <w:t xml:space="preserve">4.5</w:t>
+            </w:r>
+          </w:p>
+        </w:tc>
+        <w:tc>
+          <w:tcPr/>
+          <w:p>
+            <w:pPr>
+              <w:pStyle w:val="Compact"/>
+            </w:pPr>
+            <w:r>
+              <w:t xml:space="preserve">2026-10-21</w:t>
+            </w:r>
+          </w:p>
+        </w:tc>
+        <w:tc>
+          <w:tcPr/>
+          <w:p>
+            <w:pPr>
+              <w:pStyle w:val="Compact"/>
+            </w:pPr>
+            <w:r>
+              <w:t xml:space="preserve">Review against the code of October 21, 2026: the receipt is reduced below 2 MB before it is sent and the QR can be enlarged with</w:t>
+            </w:r>
+            <w:r>
+              <w:t xml:space="preserve"> </w:t>
+            </w:r>
+            <w:r>
+              <w:rPr>
+                <w:b/>
+                <w:bCs/>
+              </w:rPr>
+              <w:t xml:space="preserve">Enlarge QR</w:t>
+            </w:r>
+            <w:r>
+              <w:t xml:space="preserve"> </w:t>
+            </w:r>
+            <w:r>
+              <w:t xml:space="preserve">(section 10.1.5); Cash only appears if the business keeps that account active; bookings nobody starts close on their own one hour after their end time (Table 7, section 10.2.3, and frequently asked questions); when signing out, the other tabs sign out too (section 12); the mobile app asks to install the new APK when it is published (section 6.2). The date and the version of the cover were corrected.</w:t>
+            </w:r>
+          </w:p>
+        </w:tc>
+        <w:tc>
+          <w:tcPr/>
+          <w:p>
+            <w:pPr>
+              <w:pStyle w:val="Compact"/>
+            </w:pPr>
+            <w:r>
+              <w:t xml:space="preserve">Development team</w:t>
+            </w:r>
+          </w:p>
+        </w:tc>
+      </w:tr>
+      <w:tr>
+        <w:tc>
+          <w:tcPr/>
+          <w:p>
+            <w:pPr>
+              <w:pStyle w:val="Compact"/>
+            </w:pPr>
+            <w:r>
+              <w:t xml:space="preserve">4.6</w:t>
+            </w:r>
+          </w:p>
+        </w:tc>
+        <w:tc>
+          <w:tcPr/>
+          <w:p>
+            <w:pPr>
+              <w:pStyle w:val="Compact"/>
+            </w:pPr>
+            <w:r>
+              <w:t xml:space="preserve">2026-10-21</w:t>
+            </w:r>
+          </w:p>
+        </w:tc>
+        <w:tc>
+          <w:tcPr/>
+          <w:p>
+            <w:pPr>
+              <w:pStyle w:val="Compact"/>
+            </w:pPr>
+            <w:r>
+              <w:t xml:space="preserve">Change of the rule for bookings that end without being recorded, reviewed by the team on the night of October 21: only a confirmed booking that never had an operator becomes No show on its own; if it had an operator, the operator receives the notice "¿Atendiste este servicio?" (did you serve this booking?) and the administrator closes it (Table 7, sections 10.2.3 and 10.2.4, and frequently asked questions). The schedule and the assigned services no longer show cancelled or No show bookings.</w:t>
+            </w:r>
+          </w:p>
+        </w:tc>
+        <w:tc>
+          <w:tcPr/>
+          <w:p>
+            <w:pPr>
+              <w:pStyle w:val="Compact"/>
+            </w:pPr>
+            <w:r>
+              <w:t xml:space="preserve">Development team</w:t>
+            </w:r>
+          </w:p>
+        </w:tc>
+      </w:tr>
     </w:tbl>
     <w:p>
       <w:pPr>
@@ -1615,7 +1723,7 @@
         </w:numPr>
       </w:pPr>
       <w:r>
-        <w:t xml:space="preserve">The Android mobile application (React Native with Expo), which offers equivalent modules for the three roles. It is downloaded from the home page of the web with the download button or the QR code; this manual documents only the web version.</w:t>
+        <w:t xml:space="preserve">The Android mobile application (React Native with Expo), which offers equivalent modules for the three roles. It is downloaded from the home page of the web with the download button or the QR code; this manual documents only the web version. Since October 21, 2026, when the business publishes a new version of the APK, the app shows a screen that asks to download and install it before going on.</w:t>
       </w:r>
     </w:p>
     <w:p>
@@ -7644,7 +7752,7 @@
               <w:pStyle w:val="Compact"/>
             </w:pPr>
             <w:r>
-              <w:t xml:space="preserve">The booking was voided by the customer or by the business.</w:t>
+              <w:t xml:space="preserve">The booking was voided by the customer or by the business, or the system closed it because one hour passed after its end without being confirmed.</w:t>
             </w:r>
           </w:p>
         </w:tc>
@@ -7679,7 +7787,7 @@
               <w:pStyle w:val="Compact"/>
             </w:pPr>
             <w:r>
-              <w:t xml:space="preserve">The customer did not arrive at the booked slot.</w:t>
+              <w:t xml:space="preserve">The customer did not arrive at the booked slot and the business recorded it. If the confirmed booking never had an operator, the system marks it this way one hour after its end time.</w:t>
             </w:r>
           </w:p>
         </w:tc>
@@ -8016,7 +8124,7 @@
               <w:pStyle w:val="Compact"/>
             </w:pPr>
             <w:r>
-              <w:t xml:space="preserve">Paid at the business when the service is received. No QR code is shown.</w:t>
+              <w:t xml:space="preserve">Paid at the business when the service is received. No QR code is shown. It only appears if the business keeps the cash account active.</w:t>
             </w:r>
           </w:p>
         </w:tc>
@@ -8048,7 +8156,7 @@
         <w:t xml:space="preserve"> </w:t>
       </w:r>
       <w:r>
-        <w:t xml:space="preserve">The digital methods shown depend on the payment accounts that the administrator keeps active.</w:t>
+        <w:t xml:space="preserve">The methods shown, Cash included, depend on the payment accounts that the administrator keeps active.</w:t>
       </w:r>
     </w:p>
     <w:p>
@@ -8396,7 +8504,55 @@
         <w:t xml:space="preserve">Amount to pay</w:t>
       </w:r>
       <w:r>
-        <w:t xml:space="preserve">.</w:t>
+        <w:t xml:space="preserve">. If the code is hard to read,</w:t>
+      </w:r>
+      <w:r>
+        <w:t xml:space="preserve"> </w:t>
+      </w:r>
+      <w:r>
+        <w:rPr>
+          <w:b/>
+          <w:bCs/>
+        </w:rPr>
+        <w:t xml:space="preserve">Enlarge QR</w:t>
+      </w:r>
+      <w:r>
+        <w:t xml:space="preserve"> </w:t>
+      </w:r>
+      <w:r>
+        <w:t xml:space="preserve">shows it bigger, with</w:t>
+      </w:r>
+      <w:r>
+        <w:t xml:space="preserve"> </w:t>
+      </w:r>
+      <w:r>
+        <w:rPr>
+          <w:b/>
+          <w:bCs/>
+        </w:rPr>
+        <w:t xml:space="preserve">Zoom in</w:t>
+      </w:r>
+      <w:r>
+        <w:t xml:space="preserve"> </w:t>
+      </w:r>
+      <w:r>
+        <w:t xml:space="preserve">and</w:t>
+      </w:r>
+      <w:r>
+        <w:t xml:space="preserve"> </w:t>
+      </w:r>
+      <w:r>
+        <w:rPr>
+          <w:b/>
+          <w:bCs/>
+        </w:rPr>
+        <w:t xml:space="preserve">Zoom out</w:t>
+      </w:r>
+      <w:r>
+        <w:t xml:space="preserve"> </w:t>
+      </w:r>
+      <w:r>
+        <w:t xml:space="preserve">(also with the mouse wheel or a double click).</w:t>
       </w:r>
     </w:p>
     <w:p>
@@ -8421,7 +8577,7 @@
         <w:t xml:space="preserve">Confirm your payment</w:t>
       </w:r>
       <w:r>
-        <w:t xml:space="preserve">, drag the image of the receipt or click to browse for it (JPG or PNG, maximum 10 MB).</w:t>
+        <w:t xml:space="preserve">, drag the image of the receipt or click to browse for it (JPG or PNG of up to 10 MB). The page reduces it below 2 MB before sending it; meanwhile it shows "Preparing the receipt...".</w:t>
       </w:r>
     </w:p>
     <w:p>
@@ -8610,6 +8766,18 @@
       </w:pPr>
       <w:r>
         <w:t xml:space="preserve">If the administrator rejects the payment, the customer can report it again with a correct receipt.</w:t>
+      </w:r>
+    </w:p>
+    <w:p>
+      <w:pPr>
+        <w:pStyle w:val="Compact"/>
+        <w:numPr>
+          <w:ilvl w:val="0"/>
+          <w:numId w:val="1022"/>
+        </w:numPr>
+      </w:pPr>
+      <w:r>
+        <w:t xml:space="preserve">If the image cannot be reduced below 2 MB, the message "We could not reduce the image below 2 MB. Try a screenshot of the receipt." appears.</w:t>
       </w:r>
     </w:p>
     <w:p>
@@ -12609,7 +12777,36 @@
         <w:t xml:space="preserve"> </w:t>
       </w:r>
       <w:r>
-        <w:t xml:space="preserve">The service can be started from 15 minutes before the booked time. The operator can only update the services assigned to them.</w:t>
+        <w:t xml:space="preserve">The service can be started from 15 minutes before the booked time. The operator can only update the services assigned to them. Every service must be recorded with</w:t>
+      </w:r>
+      <w:r>
+        <w:t xml:space="preserve"> </w:t>
+      </w:r>
+      <w:r>
+        <w:rPr>
+          <w:b/>
+          <w:bCs/>
+        </w:rPr>
+        <w:t xml:space="preserve">Start</w:t>
+      </w:r>
+      <w:r>
+        <w:t xml:space="preserve"> </w:t>
+      </w:r>
+      <w:r>
+        <w:t xml:space="preserve">and</w:t>
+      </w:r>
+      <w:r>
+        <w:t xml:space="preserve"> </w:t>
+      </w:r>
+      <w:r>
+        <w:rPr>
+          <w:b/>
+          <w:bCs/>
+        </w:rPr>
+        <w:t xml:space="preserve">Finish</w:t>
+      </w:r>
+      <w:r>
+        <w:t xml:space="preserve">, even if late: if the time of the service has already passed, it can still be started and finished on the same day, and the real hours count. If an assigned service was not started when its time ended, or was started and not finished one hour after its end time, the operator receives the notice "¿Atendiste este servicio?" (did you serve this booking?) and the administrator sees the booking in the list of bookings to close; if it can no longer be recorded, the operator tells the administrator whether the vehicle was served, and the administrator closes it. The schedule and the assigned services list do not show cancelled bookings or those left as No show.</w:t>
       </w:r>
     </w:p>
     <w:p>
@@ -12966,7 +13163,7 @@
         <w:pStyle w:val="FirstParagraph"/>
       </w:pPr>
       <w:r>
-        <w:t xml:space="preserve">The operator's notifications work like the customer's (section 10.1.7). The most frequent notices are a new service assigned, a service moved to another time, a service cancelled, and a service reassigned to another operator. These staff notices arrive in the inbox and as push notifications, never by email. The operator opens them with</w:t>
+        <w:t xml:space="preserve">The operator's notifications work like the customer's (section 10.1.7). The most frequent notices are a new service assigned, a service moved to another time, a service cancelled, and a service reassigned to another operator. Since October 21, 2026 the notice "¿Atendiste este servicio?" (did you serve this booking?) also arrives when a service's time ended and it was not started or not finished (only once per booking, section 10.2.3). These staff notices arrive in the inbox and as push notifications, never by email. The operator opens them with</w:t>
       </w:r>
       <w:r>
         <w:t xml:space="preserve"> </w:t>
@@ -14778,7 +14975,7 @@
               <w:pStyle w:val="Compact"/>
             </w:pPr>
             <w:r>
-              <w:t xml:space="preserve">The one-hour session ended.</w:t>
+              <w:t xml:space="preserve">The one-hour session ended, or the session was closed (for example, because the administrator deactivated the account).</w:t>
             </w:r>
           </w:p>
         </w:tc>
@@ -15315,6 +15512,41 @@
             </w:pPr>
             <w:r>
               <w:t xml:space="preserve">Start the service before finishing it.</w:t>
+            </w:r>
+          </w:p>
+        </w:tc>
+      </w:tr>
+      <w:tr>
+        <w:tc>
+          <w:tcPr/>
+          <w:p>
+            <w:pPr>
+              <w:pStyle w:val="Compact"/>
+            </w:pPr>
+            <w:r>
+              <w:t xml:space="preserve">We could not reduce the image below 2 MB. Try a screenshot of the receipt.</w:t>
+            </w:r>
+          </w:p>
+        </w:tc>
+        <w:tc>
+          <w:tcPr/>
+          <w:p>
+            <w:pPr>
+              <w:pStyle w:val="Compact"/>
+            </w:pPr>
+            <w:r>
+              <w:t xml:space="preserve">The photo of the receipt is too heavy even after reducing it.</w:t>
+            </w:r>
+          </w:p>
+        </w:tc>
+        <w:tc>
+          <w:tcPr/>
+          <w:p>
+            <w:pPr>
+              <w:pStyle w:val="Compact"/>
+            </w:pPr>
+            <w:r>
+              <w:t xml:space="preserve">Attach a screenshot of the receipt.</w:t>
             </w:r>
           </w:p>
         </w:tc>
@@ -15624,6 +15856,14 @@
     <w:p>
       <w:pPr>
         <w:pStyle w:val="FirstParagraph"/>
+      </w:pPr>
+      <w:r>
+        <w:t xml:space="preserve">When signing out, the other tabs of the same browser also go back to the login screen, and if another account signs in on one tab, the others reload with that account. Since October 21, 2026 the closed session does not work on the server either, even if someone had copied its access.</w:t>
+      </w:r>
+    </w:p>
+    <w:p>
+      <w:pPr>
+        <w:pStyle w:val="BodyText"/>
       </w:pPr>
       <w:r>
         <w:rPr>
@@ -15693,7 +15933,7 @@
       </w:r>
     </w:p>
     <w:bookmarkEnd w:id="158"/>
-    <w:bookmarkStart w:id="175" w:name="X7a4913db6cb1b3c4cb6c122beacaf68da4b3196"/>
+    <w:bookmarkStart w:id="177" w:name="X7a4913db6cb1b3c4cb6c122beacaf68da4b3196"/>
     <w:p>
       <w:pPr>
         <w:pStyle w:val="Heading2"/>
@@ -15860,12 +16100,30 @@
       </w:r>
     </w:p>
     <w:bookmarkEnd w:id="165"/>
-    <w:bookmarkStart w:id="166" w:name="how-do-i-pay-for-my-service"/>
+    <w:bookmarkStart w:id="166" w:name="Xd46a745d1d7bc5f1116a20cd4d2ea4d66c5912f"/>
     <w:p>
       <w:pPr>
         <w:pStyle w:val="Heading5"/>
       </w:pPr>
       <w:r>
+        <w:t xml:space="preserve">What happens if I do not arrive for my booking?</w:t>
+      </w:r>
+    </w:p>
+    <w:p>
+      <w:pPr>
+        <w:pStyle w:val="FirstParagraph"/>
+      </w:pPr>
+      <w:r>
+        <w:t xml:space="preserve">The business records the booking as No show. If the booking had no operator assigned, the system marks it this way one hour after the end time. If you had already paid, contact the business: the administrator decides on the refund.</w:t>
+      </w:r>
+    </w:p>
+    <w:bookmarkEnd w:id="166"/>
+    <w:bookmarkStart w:id="167" w:name="how-do-i-pay-for-my-service"/>
+    <w:p>
+      <w:pPr>
+        <w:pStyle w:val="Heading5"/>
+      </w:pPr>
+      <w:r>
         <w:t xml:space="preserve">How do I pay for my service?</w:t>
       </w:r>
     </w:p>
@@ -15874,11 +16132,11 @@
         <w:pStyle w:val="FirstParagraph"/>
       </w:pPr>
       <w:r>
-        <w:t xml:space="preserve">In Pay service, choose the method. With Nequi, Daviplata, or Transfer, scan the QR code, transfer the exact amount, and attach the receipt with the transaction reference; with Cash, pay at the business.</w:t>
-      </w:r>
-    </w:p>
-    <w:bookmarkEnd w:id="166"/>
-    <w:bookmarkStart w:id="167" w:name="does-the-system-store-my-card-data"/>
+        <w:t xml:space="preserve">In Pay service, choose the method. With Nequi, Daviplata, or Transfer, scan the QR code, transfer the exact amount, and attach the receipt with the transaction reference; with Cash (if the business has it active), pay at the business.</w:t>
+      </w:r>
+    </w:p>
+    <w:bookmarkEnd w:id="167"/>
+    <w:bookmarkStart w:id="168" w:name="does-the-system-store-my-card-data"/>
     <w:p>
       <w:pPr>
         <w:pStyle w:val="Heading5"/>
@@ -15895,8 +16153,8 @@
         <w:t xml:space="preserve">No. The system does not request or store card data.</w:t>
       </w:r>
     </w:p>
-    <w:bookmarkEnd w:id="167"/>
-    <w:bookmarkStart w:id="168" w:name="why-does-my-payment-appear-as-in-review"/>
+    <w:bookmarkEnd w:id="168"/>
+    <w:bookmarkStart w:id="169" w:name="why-does-my-payment-appear-as-in-review"/>
     <w:p>
       <w:pPr>
         <w:pStyle w:val="Heading5"/>
@@ -15913,8 +16171,8 @@
         <w:t xml:space="preserve">Because an administrator must verify that the money arrived in the business's account. When the administrator approves or rejects it, you receive a notification and an email; you can also check the status in History.</w:t>
       </w:r>
     </w:p>
-    <w:bookmarkEnd w:id="168"/>
-    <w:bookmarkStart w:id="169" w:name="can-i-use-a-promotion-code"/>
+    <w:bookmarkEnd w:id="169"/>
+    <w:bookmarkStart w:id="170" w:name="can-i-use-a-promotion-code"/>
     <w:p>
       <w:pPr>
         <w:pStyle w:val="Heading5"/>
@@ -15931,8 +16189,8 @@
         <w:t xml:space="preserve">Yes. When your points unlock a coupon, you receive a notice with its code. In Pay service, type it in Coupon code and click Apply before confirming the payment.</w:t>
       </w:r>
     </w:p>
-    <w:bookmarkEnd w:id="169"/>
-    <w:bookmarkStart w:id="170" w:name="how-do-i-earn-loyalty-points"/>
+    <w:bookmarkEnd w:id="170"/>
+    <w:bookmarkStart w:id="171" w:name="how-do-i-earn-loyalty-points"/>
     <w:p>
       <w:pPr>
         <w:pStyle w:val="Heading5"/>
@@ -15949,8 +16207,8 @@
         <w:t xml:space="preserve">Each service adds the points shown when booking ("Earns N points"). The points are credited when the administrator approves the payment of the booking, and you can see your progress in the dashboard. Points are not spent: they unlock coupons.</w:t>
       </w:r>
     </w:p>
-    <w:bookmarkEnd w:id="170"/>
-    <w:bookmarkStart w:id="171" w:name="how-do-i-rate-a-service"/>
+    <w:bookmarkEnd w:id="171"/>
+    <w:bookmarkStart w:id="172" w:name="how-do-i-rate-a-service"/>
     <w:p>
       <w:pPr>
         <w:pStyle w:val="Heading5"/>
@@ -15967,8 +16225,8 @@
         <w:t xml:space="preserve">When the booking is Completed, open History, click "Rate Service", choose from one to five stars, and, if desired, write a comment. Each booking can be rated only once.</w:t>
       </w:r>
     </w:p>
-    <w:bookmarkEnd w:id="171"/>
-    <w:bookmarkStart w:id="172" w:name="can-i-change-the-language-or-the-colors"/>
+    <w:bookmarkEnd w:id="172"/>
+    <w:bookmarkStart w:id="173" w:name="can-i-change-the-language-or-the-colors"/>
     <w:p>
       <w:pPr>
         <w:pStyle w:val="Heading5"/>
@@ -15985,8 +16243,8 @@
         <w:t xml:space="preserve">Yes. In Settings you can choose Spanish, English, French, or Portuguese and one of four color themes.</w:t>
       </w:r>
     </w:p>
-    <w:bookmarkEnd w:id="172"/>
-    <w:bookmarkStart w:id="173" w:name="can-i-delete-or-deactivate-my-account"/>
+    <w:bookmarkEnd w:id="173"/>
+    <w:bookmarkStart w:id="174" w:name="can-i-delete-or-deactivate-my-account"/>
     <w:p>
       <w:pPr>
         <w:pStyle w:val="Heading5"/>
@@ -16019,8 +16277,8 @@
         <w:t xml:space="preserve">option deactivates the account, without erasing it: you will not be able to log in, but your history is kept. To reactivate it, contact the administrator. Administrator accounts do not have this option.</w:t>
       </w:r>
     </w:p>
-    <w:bookmarkEnd w:id="173"/>
-    <w:bookmarkStart w:id="174" w:name="Xa9d4992a2ac20cb1b5580e53749c46c799fd23e"/>
+    <w:bookmarkEnd w:id="174"/>
+    <w:bookmarkStart w:id="175" w:name="Xa9d4992a2ac20cb1b5580e53749c46c799fd23e"/>
     <w:p>
       <w:pPr>
         <w:pStyle w:val="Heading5"/>
@@ -16037,9 +16295,56 @@
         <w:t xml:space="preserve">A service can only be started on the day of the booking, only if it is assigned to you, and only when you do not have another service in progress. If the service is yours and the problem continues, inform the administrator.</w:t>
       </w:r>
     </w:p>
-    <w:bookmarkEnd w:id="174"/>
     <w:bookmarkEnd w:id="175"/>
-    <w:bookmarkStart w:id="176" w:name="X0fa6fbdd5490fe47b49d10c65f8bfca49160d19"/>
+    <w:bookmarkStart w:id="176" w:name="X9e85408571aaec0f6645b6dbd7ce307bd2e8df9"/>
+    <w:p>
+      <w:pPr>
+        <w:pStyle w:val="Heading5"/>
+      </w:pPr>
+      <w:r>
+        <w:t xml:space="preserve">I served a vehicle and forgot to press Start. What do I do?</w:t>
+      </w:r>
+    </w:p>
+    <w:p>
+      <w:pPr>
+        <w:pStyle w:val="FirstParagraph"/>
+      </w:pPr>
+      <w:r>
+        <w:t xml:space="preserve">If it is still the same day, open the service and press</w:t>
+      </w:r>
+      <w:r>
+        <w:t xml:space="preserve"> </w:t>
+      </w:r>
+      <w:r>
+        <w:rPr>
+          <w:b/>
+          <w:bCs/>
+        </w:rPr>
+        <w:t xml:space="preserve">Start</w:t>
+      </w:r>
+      <w:r>
+        <w:t xml:space="preserve"> </w:t>
+      </w:r>
+      <w:r>
+        <w:t xml:space="preserve">and then</w:t>
+      </w:r>
+      <w:r>
+        <w:t xml:space="preserve"> </w:t>
+      </w:r>
+      <w:r>
+        <w:rPr>
+          <w:b/>
+          <w:bCs/>
+        </w:rPr>
+        <w:t xml:space="preserve">Finish</w:t>
+      </w:r>
+      <w:r>
+        <w:t xml:space="preserve">; the system accepts it even if it is late. If you can no longer do it, tell the administrator that the vehicle was served, so the booking is closed as attended and not as No show.</w:t>
+      </w:r>
+    </w:p>
+    <w:bookmarkEnd w:id="176"/>
+    <w:bookmarkEnd w:id="177"/>
+    <w:bookmarkStart w:id="178" w:name="X0fa6fbdd5490fe47b49d10c65f8bfca49160d19"/>
     <w:p>
       <w:pPr>
         <w:pStyle w:val="Heading2"/>
@@ -16536,8 +16841,8 @@
         <w:t xml:space="preserve">Based on the glossary of the project documentation.</w:t>
       </w:r>
     </w:p>
-    <w:bookmarkEnd w:id="176"/>
-    <w:bookmarkStart w:id="180" w:name="references"/>
+    <w:bookmarkEnd w:id="178"/>
+    <w:bookmarkStart w:id="182" w:name="references"/>
     <w:p>
       <w:pPr>
         <w:pStyle w:val="Heading2"/>
@@ -16572,7 +16877,7 @@
       <w:r>
         <w:t xml:space="preserve"> </w:t>
       </w:r>
-      <w:hyperlink r:id="rId177">
+      <w:hyperlink r:id="rId179">
         <w:r>
           <w:rPr>
             <w:rStyle w:val="Hyperlink"/>
@@ -16631,7 +16936,7 @@
       <w:r>
         <w:t xml:space="preserve"> </w:t>
       </w:r>
-      <w:hyperlink r:id="rId178">
+      <w:hyperlink r:id="rId180">
         <w:r>
           <w:rPr>
             <w:rStyle w:val="Hyperlink"/>
@@ -16666,7 +16971,7 @@
       <w:r>
         <w:t xml:space="preserve"> </w:t>
       </w:r>
-      <w:hyperlink r:id="rId179">
+      <w:hyperlink r:id="rId181">
         <w:r>
           <w:rPr>
             <w:rStyle w:val="Hyperlink"/>
@@ -16675,8 +16980,8 @@
         </w:r>
       </w:hyperlink>
     </w:p>
-    <w:bookmarkEnd w:id="180"/>
-    <w:bookmarkStart w:id="183" w:name="X8cfa2d58357511abd614ba97b7597f227b1ab02"/>
+    <w:bookmarkEnd w:id="182"/>
+    <w:bookmarkStart w:id="185" w:name="X8cfa2d58357511abd614ba97b7597f227b1ab02"/>
     <w:p>
       <w:pPr>
         <w:pStyle w:val="Heading2"/>
@@ -16685,7 +16990,7 @@
         <w:t xml:space="preserve">15. Annexes</w:t>
       </w:r>
     </w:p>
-    <w:bookmarkStart w:id="181" w:name="annex-a-source-of-the-screenshots"/>
+    <w:bookmarkStart w:id="183" w:name="annex-a-source-of-the-screenshots"/>
     <w:p>
       <w:pPr>
         <w:pStyle w:val="Heading3"/>
@@ -16747,8 +17052,8 @@
         <w:t xml:space="preserve">folder.</w:t>
       </w:r>
     </w:p>
-    <w:bookmarkEnd w:id="181"/>
-    <w:bookmarkStart w:id="182" w:name="annex-b-delivery-checklist"/>
+    <w:bookmarkEnd w:id="183"/>
+    <w:bookmarkStart w:id="184" w:name="annex-b-delivery-checklist"/>
     <w:p>
       <w:pPr>
         <w:pStyle w:val="Heading3"/>
@@ -17053,9 +17358,9 @@
         <w:t xml:space="preserve">Adapted from the checklist of the guide for writing software manuals (SENA, 2026).</w:t>
       </w:r>
     </w:p>
-    <w:bookmarkEnd w:id="182"/>
-    <w:bookmarkEnd w:id="183"/>
     <w:bookmarkEnd w:id="184"/>
+    <w:bookmarkEnd w:id="185"/>
+    <w:bookmarkEnd w:id="186"/>
     <w:sectPr>
       <w:footnotePr>
         <w:numRestart w:val="eachSect"/>

</xml_diff>